<commit_message>
Add advance showcase planning milestones
</commit_message>
<xml_diff>
--- a/STARLAB_Unit_5/Teaching Guides/Week_21_Understanding_Scientific_Reports.docx
+++ b/STARLAB_Unit_5/Teaching Guides/Week_21_Understanding_Scientific_Reports.docx
@@ -372,6 +372,29 @@
         <w:pStyle w:val="Heading2"/>
       </w:pPr>
       <w:r>
+        <w:t>Teacher-Only Showcase Planning Milestone</w:t>
+      </w:r>
+    </w:p>
+    <w:p>
+      <w:pPr/>
+      <w:r>
+        <w:t>Milestone 1 - Event framework (approximately 12 weeks before Week 33): select the public showcase format, tentative date and time, intended public audience, venue, and administrative or district support. Use the STARLAB Showcase Planning Kit and Unit 5 Appendix S as planning references.</w:t>
+      </w:r>
+    </w:p>
+    <w:p>
+      <w:pPr/>
+      <w:r>
+        <w:rPr>
+          <w:b/>
+        </w:rPr>
+        <w:t>This is teacher planning only. Do not add a student assignment, handout, deliverable, or print requirement this week.</w:t>
+      </w:r>
+    </w:p>
+    <w:p>
+      <w:pPr>
+        <w:pStyle w:val="Heading2"/>
+      </w:pPr>
+      <w:r>
         <w:t>Week 21 Deliverables</w:t>
       </w:r>
     </w:p>

</xml_diff>